<commit_message>
docs: dọn văn phong AI khỏi Vision Document (bỏ 5 em dash)
</commit_message>
<xml_diff>
--- a/docs/PA1_Vision_Sota.docx
+++ b/docs/PA1_Vision_Sota.docx
@@ -388,11 +388,7 @@
           <w:hyperlink w:history="1" w:anchor="_Toc1">
             <w:r>
               <w:t xml:space="preserve">Revision History</w:t>
-            </w:r>
-            <w:r>
               <w:tab/>
-            </w:r>
-            <w:r>
               <w:fldChar w:fldCharType="begin" w:dirty="true"/>
               <w:instrText xml:space="preserve">PAGEREF _Toc1 \h</w:instrText>
               <w:fldChar w:fldCharType="separate"/>
@@ -411,11 +407,7 @@
           <w:hyperlink w:history="1" w:anchor="_Toc2">
             <w:r>
               <w:t xml:space="preserve">Table of Contents</w:t>
-            </w:r>
-            <w:r>
               <w:tab/>
-            </w:r>
-            <w:r>
               <w:fldChar w:fldCharType="begin" w:dirty="true"/>
               <w:instrText xml:space="preserve">PAGEREF _Toc2 \h</w:instrText>
               <w:fldChar w:fldCharType="separate"/>
@@ -433,11 +425,7 @@
           <w:hyperlink w:history="1" w:anchor="_Toc3">
             <w:r>
               <w:t xml:space="preserve">1. Introduction</w:t>
-            </w:r>
-            <w:r>
               <w:tab/>
-            </w:r>
-            <w:r>
               <w:fldChar w:fldCharType="begin" w:dirty="true"/>
               <w:instrText xml:space="preserve">PAGEREF _Toc3 \h</w:instrText>
               <w:fldChar w:fldCharType="separate"/>
@@ -456,11 +444,7 @@
           <w:hyperlink w:history="1" w:anchor="_Toc4">
             <w:r>
               <w:t xml:space="preserve">1.1 References</w:t>
-            </w:r>
-            <w:r>
               <w:tab/>
-            </w:r>
-            <w:r>
               <w:fldChar w:fldCharType="begin" w:dirty="true"/>
               <w:instrText xml:space="preserve">PAGEREF _Toc4 \h</w:instrText>
               <w:fldChar w:fldCharType="separate"/>
@@ -478,11 +462,7 @@
           <w:hyperlink w:history="1" w:anchor="_Toc5">
             <w:r>
               <w:t xml:space="preserve">2. Positioning</w:t>
-            </w:r>
-            <w:r>
               <w:tab/>
-            </w:r>
-            <w:r>
               <w:fldChar w:fldCharType="begin" w:dirty="true"/>
               <w:instrText xml:space="preserve">PAGEREF _Toc5 \h</w:instrText>
               <w:fldChar w:fldCharType="separate"/>
@@ -501,11 +481,7 @@
           <w:hyperlink w:history="1" w:anchor="_Toc6">
             <w:r>
               <w:t xml:space="preserve">2.1 Problem Statement</w:t>
-            </w:r>
-            <w:r>
               <w:tab/>
-            </w:r>
-            <w:r>
               <w:fldChar w:fldCharType="begin" w:dirty="true"/>
               <w:instrText xml:space="preserve">PAGEREF _Toc6 \h</w:instrText>
               <w:fldChar w:fldCharType="separate"/>
@@ -524,11 +500,7 @@
           <w:hyperlink w:history="1" w:anchor="_Toc7">
             <w:r>
               <w:t xml:space="preserve">2.2 Product Position Statement</w:t>
-            </w:r>
-            <w:r>
               <w:tab/>
-            </w:r>
-            <w:r>
               <w:fldChar w:fldCharType="begin" w:dirty="true"/>
               <w:instrText xml:space="preserve">PAGEREF _Toc7 \h</w:instrText>
               <w:fldChar w:fldCharType="separate"/>
@@ -546,11 +518,7 @@
           <w:hyperlink w:history="1" w:anchor="_Toc8">
             <w:r>
               <w:t xml:space="preserve">3. Stakeholder and User Descriptions</w:t>
-            </w:r>
-            <w:r>
               <w:tab/>
-            </w:r>
-            <w:r>
               <w:fldChar w:fldCharType="begin" w:dirty="true"/>
               <w:instrText xml:space="preserve">PAGEREF _Toc8 \h</w:instrText>
               <w:fldChar w:fldCharType="separate"/>
@@ -569,11 +537,7 @@
           <w:hyperlink w:history="1" w:anchor="_Toc9">
             <w:r>
               <w:t xml:space="preserve">3.1 Stakeholder Summary</w:t>
-            </w:r>
-            <w:r>
               <w:tab/>
-            </w:r>
-            <w:r>
               <w:fldChar w:fldCharType="begin" w:dirty="true"/>
               <w:instrText xml:space="preserve">PAGEREF _Toc9 \h</w:instrText>
               <w:fldChar w:fldCharType="separate"/>
@@ -592,11 +556,7 @@
           <w:hyperlink w:history="1" w:anchor="_Toc10">
             <w:r>
               <w:t xml:space="preserve">3.2 User Summary</w:t>
-            </w:r>
-            <w:r>
               <w:tab/>
-            </w:r>
-            <w:r>
               <w:fldChar w:fldCharType="begin" w:dirty="true"/>
               <w:instrText xml:space="preserve">PAGEREF _Toc10 \h</w:instrText>
               <w:fldChar w:fldCharType="separate"/>
@@ -615,11 +575,7 @@
           <w:hyperlink w:history="1" w:anchor="_Toc11">
             <w:r>
               <w:t xml:space="preserve">3.3 User Environment</w:t>
-            </w:r>
-            <w:r>
               <w:tab/>
-            </w:r>
-            <w:r>
               <w:fldChar w:fldCharType="begin" w:dirty="true"/>
               <w:instrText xml:space="preserve">PAGEREF _Toc11 \h</w:instrText>
               <w:fldChar w:fldCharType="separate"/>
@@ -638,11 +594,7 @@
           <w:hyperlink w:history="1" w:anchor="_Toc12">
             <w:r>
               <w:t xml:space="preserve">3.4 Summary of Key Stakeholder or User Needs</w:t>
-            </w:r>
-            <w:r>
               <w:tab/>
-            </w:r>
-            <w:r>
               <w:fldChar w:fldCharType="begin" w:dirty="true"/>
               <w:instrText xml:space="preserve">PAGEREF _Toc12 \h</w:instrText>
               <w:fldChar w:fldCharType="separate"/>
@@ -661,11 +613,7 @@
           <w:hyperlink w:history="1" w:anchor="_Toc13">
             <w:r>
               <w:t xml:space="preserve">3.5 Alternatives and Competition</w:t>
-            </w:r>
-            <w:r>
               <w:tab/>
-            </w:r>
-            <w:r>
               <w:fldChar w:fldCharType="begin" w:dirty="true"/>
               <w:instrText xml:space="preserve">PAGEREF _Toc13 \h</w:instrText>
               <w:fldChar w:fldCharType="separate"/>
@@ -683,11 +631,7 @@
           <w:hyperlink w:history="1" w:anchor="_Toc14">
             <w:r>
               <w:t xml:space="preserve">4. Product Overview</w:t>
-            </w:r>
-            <w:r>
               <w:tab/>
-            </w:r>
-            <w:r>
               <w:fldChar w:fldCharType="begin" w:dirty="true"/>
               <w:instrText xml:space="preserve">PAGEREF _Toc14 \h</w:instrText>
               <w:fldChar w:fldCharType="separate"/>
@@ -706,11 +650,7 @@
           <w:hyperlink w:history="1" w:anchor="_Toc15">
             <w:r>
               <w:t xml:space="preserve">4.1 Product Perspective</w:t>
-            </w:r>
-            <w:r>
               <w:tab/>
-            </w:r>
-            <w:r>
               <w:fldChar w:fldCharType="begin" w:dirty="true"/>
               <w:instrText xml:space="preserve">PAGEREF _Toc15 \h</w:instrText>
               <w:fldChar w:fldCharType="separate"/>
@@ -729,11 +669,7 @@
           <w:hyperlink w:history="1" w:anchor="_Toc16">
             <w:r>
               <w:t xml:space="preserve">4.2 Assumptions and Dependencies</w:t>
-            </w:r>
-            <w:r>
               <w:tab/>
-            </w:r>
-            <w:r>
               <w:fldChar w:fldCharType="begin" w:dirty="true"/>
               <w:instrText xml:space="preserve">PAGEREF _Toc16 \h</w:instrText>
               <w:fldChar w:fldCharType="separate"/>
@@ -751,11 +687,7 @@
           <w:hyperlink w:history="1" w:anchor="_Toc17">
             <w:r>
               <w:t xml:space="preserve">5. Product Features</w:t>
-            </w:r>
-            <w:r>
               <w:tab/>
-            </w:r>
-            <w:r>
               <w:fldChar w:fldCharType="begin" w:dirty="true"/>
               <w:instrText xml:space="preserve">PAGEREF _Toc17 \h</w:instrText>
               <w:fldChar w:fldCharType="separate"/>
@@ -773,11 +705,7 @@
           <w:hyperlink w:history="1" w:anchor="_Toc18">
             <w:r>
               <w:t xml:space="preserve">6. Other Product Requirements (Non-Functional Requirements)</w:t>
-            </w:r>
-            <w:r>
               <w:tab/>
-            </w:r>
-            <w:r>
               <w:fldChar w:fldCharType="begin" w:dirty="true"/>
               <w:instrText xml:space="preserve">PAGEREF _Toc18 \h</w:instrText>
               <w:fldChar w:fldCharType="separate"/>
@@ -2890,7 +2818,7 @@
           <w:sz w:val="22"/>
           <w:szCs w:val="22"/>
         </w:rPr>
-        <w:t xml:space="preserve">Không gian sử dụng: bất kỳ đâu có Internet — tại nhà trước khi đi tham quan, hoặc tại văn phòng quản trị bảo tàng.</w:t>
+        <w:t xml:space="preserve">Không gian sử dụng: bất kỳ đâu có Internet, tại nhà trước khi đi tham quan hoặc tại văn phòng quản trị bảo tàng.</w:t>
       </w:r>
     </w:p>
     <w:p>
@@ -4117,7 +4045,7 @@
                 <w:sz w:val="20"/>
                 <w:szCs w:val="20"/>
               </w:rPr>
-              <w:t xml:space="preserve">Hệ thống bán vé online riêng lẻ (vd Bảo tàng Chứng tích Chiến tranh — ticket.baotangchungtichchientranh.vn)</w:t>
+              <w:t xml:space="preserve">Hệ thống bán vé online riêng lẻ (vd Bảo tàng Chứng tích Chiến tranh, ticket.baotangchungtichchientranh.vn)</w:t>
             </w:r>
           </w:p>
         </w:tc>
@@ -4264,7 +4192,7 @@
                 <w:sz w:val="20"/>
                 <w:szCs w:val="20"/>
               </w:rPr>
-              <w:t xml:space="preserve">Không có module đặt vé/lưu niệm riêng cho từng bảo tàng; cần thiết bị chụp 360°/gigapixel chuyên dụng mà nhóm không có — đây là lý do Sota chỉ làm gallery ảnh 360° đơn giản thay vì sao chép đầy đủ công nghệ này</w:t>
+              <w:t xml:space="preserve">Không có module đặt vé/lưu niệm riêng cho từng bảo tàng. Công nghệ của họ cần thiết bị chụp 360°/gigapixel chuyên dụng mà nhóm không có, nên Sota chỉ làm gallery ảnh 360° đơn giản thay vì sao chép đầy đủ công nghệ này</w:t>
             </w:r>
           </w:p>
         </w:tc>
@@ -4306,7 +4234,7 @@
           <w:sz w:val="22"/>
           <w:szCs w:val="22"/>
         </w:rPr>
-        <w:t xml:space="preserve">Sota là một nền tảng web độc lập: sản phẩm không thay thế và cũng không phải một phần của hệ thống nào đang có sẵn. Ứng dụng được xây dựng bằng Next.js (App Router, TypeScript), dùng Supabase (PostgreSQL + Auth) làm backend và CSDL quan hệ, Prisma làm ORM, và Stripe (chế độ test/sandbox) để xử lý thanh toán vé và đơn hàng lưu niệm — thay vì nhóm tự xây dựng và vận hành máy chủ riêng hay cổng thanh toán riêng.</w:t>
+        <w:t xml:space="preserve">Sota là một nền tảng web độc lập: sản phẩm không thay thế và cũng không phải một phần của hệ thống nào đang có sẵn. Ứng dụng được xây dựng bằng Next.js (App Router, TypeScript), dùng Supabase (PostgreSQL + Auth) làm backend và CSDL quan hệ, Prisma làm ORM, và Stripe (chế độ test/sandbox) để xử lý thanh toán vé và đơn hàng lưu niệm, thay vì nhóm tự xây dựng và vận hành máy chủ riêng hay cổng thanh toán riêng.</w:t>
       </w:r>
     </w:p>
     <w:p>
@@ -4319,7 +4247,7 @@
           <w:sz w:val="22"/>
           <w:szCs w:val="22"/>
         </w:rPr>
-        <w:t xml:space="preserve">Vì các bảo tàng Việt Nam hiện chưa công khai dữ liệu số hóa qua API (đã xác minh qua khảo sát các bảo tàng tại TPHCM), nhóm dùng Smithsonian Open Access API (Viện Smithsonian, Washington D.C., Mỹ — 21 bảo tàng, trung tâm nghiên cứu và thư viện, cấp phép CC0, hơn 5,1 triệu hiện vật số hóa) làm nguồn dữ liệu hiện vật thật để triển khai đầy đủ các tính năng showcase trên một cụm bảo tàng có thật. Dự án không đại diện hay hợp tác chính thức với Smithsonian — chỉ sử dụng dữ liệu mở công khai cho mục đích học tập.</w:t>
+        <w:t xml:space="preserve">Vì các bảo tàng Việt Nam hiện chưa công khai dữ liệu số hóa qua API (đã xác minh qua khảo sát các bảo tàng tại TPHCM), nhóm dùng Smithsonian Open Access API (Viện Smithsonian, Washington D.C., Mỹ, 21 bảo tàng, trung tâm nghiên cứu và thư viện, cấp phép CC0, hơn 5,1 triệu hiện vật số hóa) làm nguồn dữ liệu hiện vật thật để triển khai đầy đủ các tính năng showcase trên một cụm bảo tàng có thật. Dự án không đại diện hay hợp tác chính thức với Smithsonian. Nhóm chỉ sử dụng dữ liệu mở công khai cho mục đích học tập.</w:t>
       </w:r>
     </w:p>
     <w:p>

</xml_diff>